<commit_message>
knowleddge 7/3/2026 part 16
</commit_message>
<xml_diff>
--- a/Knowledge/3-Work knowledge/1-Software Engineering/2-General Technologies/9-Databases/5-My Source/2-SQL/7-SQL Commands - Administrative Commands/7-SQL ALTER DATABASE.docx
+++ b/Knowledge/3-Work knowledge/1-Software Engineering/2-General Technologies/9-Databases/5-My Source/2-SQL/7-SQL Commands - Administrative Commands/7-SQL ALTER DATABASE.docx
@@ -11,21 +11,6 @@
       <w:r>
         <w:t>SQL ALTER DATABASE</w:t>
       </w:r>
-    </w:p>
-    <w:p>
-      <w:pPr>
-        <w:pStyle w:val="Heading2"/>
-        <w:keepNext w:val="0"/>
-        <w:keepLines w:val="0"/>
-        <w:rPr>
-          <w:rFonts w:ascii="Roboto Mono" w:eastAsia="Roboto Mono" w:hAnsi="Roboto Mono" w:cs="Roboto Mono"/>
-          <w:b/>
-          <w:bCs/>
-          <w:color w:val="188038"/>
-          <w:sz w:val="34"/>
-          <w:szCs w:val="34"/>
-        </w:rPr>
-      </w:pPr>
       <w:bookmarkStart w:id="1" w:name="_gxnraxbzy9vf" w:colFirst="0" w:colLast="0"/>
       <w:bookmarkEnd w:id="1"/>
     </w:p>
@@ -39,7 +24,13 @@
       <w:bookmarkStart w:id="2" w:name="_ru1u7tw5f5bs" w:colFirst="0" w:colLast="0"/>
       <w:bookmarkEnd w:id="2"/>
       <w:r>
-        <w:t>📌 Purpose:</w:t>
+        <w:rPr>
+          <w:rFonts w:ascii="Segoe UI Emoji" w:hAnsi="Segoe UI Emoji" w:cs="Segoe UI Emoji"/>
+        </w:rPr>
+        <w:t>📌</w:t>
+      </w:r>
+      <w:r>
+        <w:t xml:space="preserve"> Purpose:</w:t>
       </w:r>
     </w:p>
     <w:p>
@@ -429,6 +420,7 @@
         <w:rPr>
           <w:noProof/>
         </w:rPr>
+        <w:lastRenderedPageBreak/>
         <w:drawing>
           <wp:inline distT="114300" distB="114300" distL="114300" distR="114300" wp14:anchorId="5DA0CA3E" wp14:editId="7C7BA514">
             <wp:extent cx="5943600" cy="977900"/>
@@ -763,6 +755,7 @@
         <w:rPr>
           <w:rFonts w:ascii="Roboto Mono" w:eastAsia="Roboto Mono" w:hAnsi="Roboto Mono"/>
         </w:rPr>
+        <w:lastRenderedPageBreak/>
         <w:t xml:space="preserve">Changing character set/collation </w:t>
       </w:r>
       <w:r>
@@ -1056,8 +1049,16 @@
         <w:rPr>
           <w:rFonts w:ascii="Roboto Mono" w:eastAsia="Roboto Mono" w:hAnsi="Roboto Mono"/>
         </w:rPr>
-        <w:t>FROM information_schema.schemata</w:t>
-      </w:r>
+        <w:t>FROM information_</w:t>
+      </w:r>
+      <w:proofErr w:type="gramStart"/>
+      <w:r>
+        <w:rPr>
+          <w:rFonts w:ascii="Roboto Mono" w:eastAsia="Roboto Mono" w:hAnsi="Roboto Mono"/>
+        </w:rPr>
+        <w:t>schema.schemata</w:t>
+      </w:r>
+      <w:proofErr w:type="gramEnd"/>
     </w:p>
     <w:p>
       <w:r>
@@ -1125,6 +1126,7 @@
       <w:bookmarkStart w:id="8" w:name="_cb8oi1gkryu7" w:colFirst="0" w:colLast="0"/>
       <w:bookmarkEnd w:id="8"/>
       <w:r>
+        <w:lastRenderedPageBreak/>
         <w:t>Example</w:t>
       </w:r>
     </w:p>
@@ -1361,6 +1363,7 @@
         <w:rPr>
           <w:noProof/>
         </w:rPr>
+        <w:lastRenderedPageBreak/>
         <w:drawing>
           <wp:inline distT="114300" distB="114300" distL="114300" distR="114300" wp14:anchorId="0DC728E5" wp14:editId="2C789AC1">
             <wp:extent cx="5943600" cy="3517900"/>
@@ -1411,8 +1414,16 @@
         <w:rPr>
           <w:rFonts w:ascii="Roboto Mono" w:eastAsia="Roboto Mono" w:hAnsi="Roboto Mono"/>
         </w:rPr>
-        <w:t>FROM information_schema.schemata</w:t>
-      </w:r>
+        <w:t>FROM information_</w:t>
+      </w:r>
+      <w:proofErr w:type="gramStart"/>
+      <w:r>
+        <w:rPr>
+          <w:rFonts w:ascii="Roboto Mono" w:eastAsia="Roboto Mono" w:hAnsi="Roboto Mono"/>
+        </w:rPr>
+        <w:t>schema.schemata</w:t>
+      </w:r>
+      <w:proofErr w:type="gramEnd"/>
     </w:p>
     <w:p>
       <w:r>
@@ -1472,6 +1483,7 @@
       <w:bookmarkStart w:id="10" w:name="_2vfh0gfl8kkk" w:colFirst="0" w:colLast="0"/>
       <w:bookmarkEnd w:id="10"/>
       <w:r>
+        <w:lastRenderedPageBreak/>
         <w:t>basic command</w:t>
       </w:r>
     </w:p>
@@ -1707,6 +1719,7 @@
         <w:rPr>
           <w:noProof/>
         </w:rPr>
+        <w:lastRenderedPageBreak/>
         <w:drawing>
           <wp:inline distT="114300" distB="114300" distL="114300" distR="114300" wp14:anchorId="0B3F79FB" wp14:editId="1D3745F6">
             <wp:extent cx="5943600" cy="2603500"/>
@@ -1757,8 +1770,16 @@
         <w:rPr>
           <w:rFonts w:ascii="Roboto Mono" w:eastAsia="Roboto Mono" w:hAnsi="Roboto Mono"/>
         </w:rPr>
-        <w:t>FROM information_schema.schemata</w:t>
-      </w:r>
+        <w:t>FROM information_</w:t>
+      </w:r>
+      <w:proofErr w:type="gramStart"/>
+      <w:r>
+        <w:rPr>
+          <w:rFonts w:ascii="Roboto Mono" w:eastAsia="Roboto Mono" w:hAnsi="Roboto Mono"/>
+        </w:rPr>
+        <w:t>schema.schemata</w:t>
+      </w:r>
+      <w:proofErr w:type="gramEnd"/>
     </w:p>
     <w:p>
       <w:r>

</xml_diff>